<commit_message>
Updated the posts to use a split common post approach.  Modified the common3 post to reflect the changes requested by Citizen.
</commit_message>
<xml_diff>
--- a/Hours Log.docx
+++ b/Hours Log.docx
@@ -83,15 +83,7 @@
     </w:p>
     <w:p>
       <w:r>
-        <w:t xml:space="preserve">Finalised HTML </w:t>
-      </w:r>
-      <w:proofErr w:type="spellStart"/>
-      <w:r>
-        <w:t>addin</w:t>
-      </w:r>
-      <w:proofErr w:type="spellEnd"/>
-      <w:r>
-        <w:t xml:space="preserve"> for testing.</w:t>
+        <w:t>Finalised HTML addin for testing.</w:t>
       </w:r>
     </w:p>
     <w:p>
@@ -142,13 +134,70 @@
           <w:b/>
           <w:bCs/>
         </w:rPr>
-        <w:t>Total hours -</w:t>
+        <w:t xml:space="preserve">Total hours </w:t>
+      </w:r>
+      <w:r>
+        <w:rPr>
+          <w:b/>
+          <w:bCs/>
+        </w:rPr>
+        <w:t>–</w:t>
       </w:r>
       <w:r>
         <w:t xml:space="preserve"> </w:t>
       </w:r>
       <w:r>
         <w:t>3</w:t>
+      </w:r>
+    </w:p>
+    <w:p>
+      <w:pPr>
+        <w:rPr>
+          <w:b/>
+          <w:bCs/>
+        </w:rPr>
+      </w:pPr>
+      <w:r>
+        <w:rPr>
+          <w:b/>
+          <w:bCs/>
+        </w:rPr>
+        <w:t>23-07-26</w:t>
+      </w:r>
+    </w:p>
+    <w:p>
+      <w:pPr>
+        <w:ind w:firstLine="720"/>
+      </w:pPr>
+      <w:r>
+        <w:t xml:space="preserve">Setup 200 series </w:t>
+      </w:r>
+      <w:r>
+        <w:t>common</w:t>
+      </w:r>
+      <w:r>
+        <w:t xml:space="preserve"> post</w:t>
+      </w:r>
+      <w:r>
+        <w:t xml:space="preserve"> working through </w:t>
+      </w:r>
+      <w:r>
+        <w:t>modified code supplied.</w:t>
+      </w:r>
+      <w:r>
+        <w:t xml:space="preserve"> </w:t>
+      </w:r>
+    </w:p>
+    <w:p>
+      <w:r>
+        <w:rPr>
+          <w:b/>
+          <w:bCs/>
+        </w:rPr>
+        <w:t>Total hours</w:t>
+      </w:r>
+      <w:r>
+        <w:t xml:space="preserve"> - 5</w:t>
       </w:r>
     </w:p>
     <w:sectPr>

</xml_diff>